<commit_message>
feat(SIMS): LMS live sessions & air-writing whiteboard, assignments, counselor notes encryption, career assessment, materials-check, self-discovery, and Phase 2 check-in audit trail
Bundles a large batch of completed SRS stories: LMS live-class hosting with
LiveKit (recording, attendance auto-capture, ML air-writing whiteboard with
pinch gestures and PNG/PDF snapshot save), assignments module, encrypted
counselor notes, career assessment, assessment materials-check, student
self-discovery, guardian wellbeing view, teacher-subject-requirements
refactor, and the Phase 2 ClassCheckIn immutable audit trail (405 guard
routes, Postgres trigger, admin/principal audit query endpoint). Also fixes
a camera-track lookup bug in the air-writing hand-tracking hook.

Co-Authored-By: Claude Sonnet 5 <noreply@anthropic.com>
</commit_message>
<xml_diff>
--- a/docs/SIMS_Phase2_Sprint_Plan_v1.0.docx
+++ b/docs/SIMS_Phase2_Sprint_Plan_v1.0.docx
@@ -8521,6 +8521,24 @@
               </w:rPr>
               <w:t xml:space="preserve"> (e.g. teacher had already tapped in), skip creation silently. Write tests for the event handler creating the record on session start and the idempotency skip.</w:t>
             </w:r>
+            <w:r>
+              <w:rPr>
+                <w:rFonts w:ascii="Courier New" w:eastAsia="Courier New" w:hAnsi="Courier New" w:cs="Courier New"/>
+                <w:color w:val="3A2A52"/>
+                <w:sz w:val="18"/>
+                <w:szCs w:val="18"/>
+              </w:rPr>
+              <w:br/>
+            </w:r>
+            <w:r>
+              <w:rPr>
+                <w:rFonts w:ascii="Courier New" w:eastAsia="Courier New" w:hAnsi="Courier New" w:cs="Courier New"/>
+                <w:color w:val="FF0000"/>
+                <w:sz w:val="18"/>
+                <w:szCs w:val="18"/>
+              </w:rPr>
+              <w:t>done</w:t>
+            </w:r>
           </w:p>
         </w:tc>
       </w:tr>
@@ -8920,6 +8938,24 @@
                 <w:szCs w:val="18"/>
               </w:rPr>
               <w:t>, including the method field. Write a test confirming update and delete endpoints return 405 Method Not Allowed.</w:t>
+            </w:r>
+            <w:r>
+              <w:rPr>
+                <w:rFonts w:ascii="Courier New" w:eastAsia="Courier New" w:hAnsi="Courier New" w:cs="Courier New"/>
+                <w:color w:val="3A2A52"/>
+                <w:sz w:val="18"/>
+                <w:szCs w:val="18"/>
+              </w:rPr>
+              <w:br/>
+            </w:r>
+            <w:r>
+              <w:rPr>
+                <w:rFonts w:ascii="Courier New" w:eastAsia="Courier New" w:hAnsi="Courier New" w:cs="Courier New"/>
+                <w:color w:val="FF0000"/>
+                <w:sz w:val="18"/>
+                <w:szCs w:val="18"/>
+              </w:rPr>
+              <w:t>done</w:t>
             </w:r>
           </w:p>
         </w:tc>

</xml_diff>

<commit_message>
feat(SIMS): Phase 2 topic-based assessment & student weakness analysis
Subject-level topic definitions with reuse/archive (P2-TB-01), per-topic mark
allocation on assessments and assignments (P2-TB-04/05/06), per-student
per-topic mark entry (P2-TB-07/08), and topic-level result views with
automatic weakness flagging plus a teacher pre-class summary (P2-TB-09/10) —
extending the existing Grades and LMS Homework modules with topic granularity.

Co-Authored-By: Claude Sonnet 5 <noreply@anthropic.com>
</commit_message>
<xml_diff>
--- a/docs/SIMS_Phase2_Sprint_Plan_v1.0.docx
+++ b/docs/SIMS_Phase2_Sprint_Plan_v1.0.docx
@@ -9549,6 +9549,24 @@
               </w:rPr>
               <w:t>-coded cards showing teacher, subject, class, and room. Write tests for the status computation at boundary conditions (exactly at threshold, 1 minute before, 1 minute after).</w:t>
             </w:r>
+            <w:r>
+              <w:rPr>
+                <w:rFonts w:ascii="Courier New" w:eastAsia="Courier New" w:hAnsi="Courier New" w:cs="Courier New"/>
+                <w:color w:val="3A2A52"/>
+                <w:sz w:val="18"/>
+                <w:szCs w:val="18"/>
+              </w:rPr>
+              <w:br/>
+            </w:r>
+            <w:r>
+              <w:rPr>
+                <w:rFonts w:ascii="Courier New" w:eastAsia="Courier New" w:hAnsi="Courier New" w:cs="Courier New"/>
+                <w:color w:val="FF0000"/>
+                <w:sz w:val="18"/>
+                <w:szCs w:val="18"/>
+              </w:rPr>
+              <w:t>done</w:t>
+            </w:r>
           </w:p>
         </w:tc>
       </w:tr>
@@ -10059,7 +10077,32 @@
                 <w:sz w:val="18"/>
                 <w:szCs w:val="18"/>
               </w:rPr>
-              <w:t>, suppressing further notifications for that period. Write tests for the one-alert-per-period deduplication and the acknowledge-suppression behavior.</w:t>
+              <w:t xml:space="preserve">, suppressing further notifications for that period. Write tests for the one-alert-per-period </w:t>
+            </w:r>
+            <w:r>
+              <w:rPr>
+                <w:rFonts w:ascii="Courier New" w:eastAsia="Courier New" w:hAnsi="Courier New" w:cs="Courier New"/>
+                <w:color w:val="3A2A52"/>
+                <w:sz w:val="18"/>
+                <w:szCs w:val="18"/>
+              </w:rPr>
+              <w:lastRenderedPageBreak/>
+              <w:t>deduplication and the acknowledge-suppression behavior.</w:t>
+            </w:r>
+            <w:r>
+              <w:rPr>
+                <w:rFonts w:ascii="Courier New" w:eastAsia="Courier New" w:hAnsi="Courier New" w:cs="Courier New"/>
+                <w:color w:val="3A2A52"/>
+                <w:sz w:val="18"/>
+                <w:szCs w:val="18"/>
+              </w:rPr>
+              <w:br/>
+            </w:r>
+            <w:r>
+              <w:rPr>
+                <w:color w:val="FF0000"/>
+              </w:rPr>
+              <w:t>done</w:t>
             </w:r>
           </w:p>
         </w:tc>
@@ -10113,7 +10156,6 @@
                 <w:sz w:val="19"/>
                 <w:szCs w:val="19"/>
               </w:rPr>
-              <w:lastRenderedPageBreak/>
               <w:t>P2-LM-</w:t>
             </w:r>
             <w:proofErr w:type="gramStart"/>
@@ -10432,6 +10474,24 @@
                 <w:szCs w:val="18"/>
               </w:rPr>
               <w:t xml:space="preserve"> value affects the status computation output immediately.</w:t>
+            </w:r>
+            <w:r>
+              <w:rPr>
+                <w:rFonts w:ascii="Courier New" w:eastAsia="Courier New" w:hAnsi="Courier New" w:cs="Courier New"/>
+                <w:color w:val="3A2A52"/>
+                <w:sz w:val="18"/>
+                <w:szCs w:val="18"/>
+              </w:rPr>
+              <w:br/>
+            </w:r>
+            <w:r>
+              <w:rPr>
+                <w:rFonts w:ascii="Courier New" w:eastAsia="Courier New" w:hAnsi="Courier New" w:cs="Courier New"/>
+                <w:color w:val="FF0000"/>
+                <w:sz w:val="18"/>
+                <w:szCs w:val="18"/>
+              </w:rPr>
+              <w:t>done</w:t>
             </w:r>
           </w:p>
         </w:tc>
@@ -10910,6 +10970,24 @@
               </w:rPr>
               <w:t xml:space="preserve"> records. Seed a default topic 'General' for subjects where the teacher hasn't yet defined topics. Write a test confirming archived topics still resolve in historical records but are excluded from the active topic list for new assessments.</w:t>
             </w:r>
+            <w:r>
+              <w:rPr>
+                <w:rFonts w:ascii="Courier New" w:eastAsia="Courier New" w:hAnsi="Courier New" w:cs="Courier New"/>
+                <w:color w:val="3A2A52"/>
+                <w:sz w:val="18"/>
+                <w:szCs w:val="18"/>
+              </w:rPr>
+              <w:br/>
+            </w:r>
+            <w:r>
+              <w:rPr>
+                <w:rFonts w:ascii="Courier New" w:eastAsia="Courier New" w:hAnsi="Courier New" w:cs="Courier New"/>
+                <w:color w:val="FF0000"/>
+                <w:sz w:val="18"/>
+                <w:szCs w:val="18"/>
+              </w:rPr>
+              <w:t>done</w:t>
+            </w:r>
           </w:p>
         </w:tc>
       </w:tr>
@@ -11403,6 +11481,24 @@
               <w:lastRenderedPageBreak/>
               <w:t>confirming the assessment total is always the sum of topic allocations and cannot be set independently.</w:t>
             </w:r>
+            <w:r>
+              <w:rPr>
+                <w:rFonts w:ascii="Courier New" w:eastAsia="Courier New" w:hAnsi="Courier New" w:cs="Courier New"/>
+                <w:color w:val="3A2A52"/>
+                <w:sz w:val="18"/>
+                <w:szCs w:val="18"/>
+              </w:rPr>
+              <w:br/>
+            </w:r>
+            <w:r>
+              <w:rPr>
+                <w:rFonts w:ascii="Courier New" w:eastAsia="Courier New" w:hAnsi="Courier New" w:cs="Courier New"/>
+                <w:color w:val="FF0000"/>
+                <w:sz w:val="18"/>
+                <w:szCs w:val="18"/>
+              </w:rPr>
+              <w:t>done</w:t>
+            </w:r>
           </w:p>
         </w:tc>
       </w:tr>
@@ -11866,6 +11962,24 @@
               </w:rPr>
               <w:t>) for that assessment automatically; remove any manual total override. Write tests for the per-cell validation and the auto-total computation.</w:t>
             </w:r>
+            <w:r>
+              <w:rPr>
+                <w:rFonts w:ascii="Courier New" w:eastAsia="Courier New" w:hAnsi="Courier New" w:cs="Courier New"/>
+                <w:color w:val="3A2A52"/>
+                <w:sz w:val="18"/>
+                <w:szCs w:val="18"/>
+              </w:rPr>
+              <w:br/>
+            </w:r>
+            <w:r>
+              <w:rPr>
+                <w:rFonts w:ascii="Courier New" w:eastAsia="Courier New" w:hAnsi="Courier New" w:cs="Courier New"/>
+                <w:color w:val="FF0000"/>
+                <w:sz w:val="18"/>
+                <w:szCs w:val="18"/>
+              </w:rPr>
+              <w:t>done</w:t>
+            </w:r>
           </w:p>
         </w:tc>
       </w:tr>
@@ -12260,6 +12374,24 @@
                 <w:szCs w:val="18"/>
               </w:rPr>
               <w:t xml:space="preserve"> per student per topic: flag true if the student's average score in that topic across the last N assessments is below the class average for that topic. Write a test for the topic weakness flag computation against seeded multi-assessment data.</w:t>
+            </w:r>
+            <w:r>
+              <w:rPr>
+                <w:rFonts w:ascii="Courier New" w:eastAsia="Courier New" w:hAnsi="Courier New" w:cs="Courier New"/>
+                <w:color w:val="3A2A52"/>
+                <w:sz w:val="18"/>
+                <w:szCs w:val="18"/>
+              </w:rPr>
+              <w:br/>
+            </w:r>
+            <w:r>
+              <w:rPr>
+                <w:rFonts w:ascii="Courier New" w:eastAsia="Courier New" w:hAnsi="Courier New" w:cs="Courier New"/>
+                <w:color w:val="FF0000"/>
+                <w:sz w:val="18"/>
+                <w:szCs w:val="18"/>
+              </w:rPr>
+              <w:t>done</w:t>
             </w:r>
           </w:p>
         </w:tc>

</xml_diff>